<commit_message>
Actualizado pagare y mutuo
</commit_message>
<xml_diff>
--- a/templates/template_pagare.docx
+++ b/templates/template_pagare.docx
@@ -13,20 +13,21 @@
           <w:sz w:val="20"/>
           <w:sz-cs w:val="20"/>
         </w:rPr>
-        <w:t xml:space="preserve">Sellado</w:t>
-      </w:r>
-    </w:p>
-    <w:p>
-      <w:pPr>
-        <w:jc w:val="center"/>
-      </w:pPr>
-      <w:r>
-        <w:rPr>
-          <w:rFonts w:ascii="Times" w:hAnsi="Times" w:cs="Times"/>
-          <w:sz w:val="20"/>
-          <w:sz-cs w:val="20"/>
-        </w:rPr>
-        <w:t xml:space="preserve"/>
+        <w:t xml:space="preserve">VENC.</w:t>
+      </w:r>
+    </w:p>
+    <w:p>
+      <w:pPr>
+        <w:jc w:val="center"/>
+      </w:pPr>
+      <w:r>
+        <w:rPr>
+          <w:rFonts w:ascii="Times" w:hAnsi="Times" w:cs="Times"/>
+          <w:sz w:val="24"/>
+          <w:sz-cs w:val="24"/>
+          <w:color w:val="0000FF"/>
+        </w:rPr>
+        <w:t xml:space="preserve">{vencimiento_pagare}</w:t>
       </w:r>
     </w:p>
     <w:p>
@@ -38,21 +39,23 @@
       <w:r>
         <w:rPr>
           <w:rFonts w:ascii="Times" w:hAnsi="Times" w:cs="Times"/>
-          <w:sz w:val="20"/>
-          <w:sz-cs w:val="20"/>
-        </w:rPr>
-        <w:t xml:space="preserve"/>
-      </w:r>
-    </w:p>
-    <w:p>
-      <w:pPr>
-        <w:jc w:val="center"/>
-      </w:pPr>
-      <w:r>
-        <w:rPr>
-          <w:rFonts w:ascii="Times" w:hAnsi="Times" w:cs="Times"/>
-          <w:sz w:val="20"/>
-          <w:sz-cs w:val="20"/>
+          <w:sz w:val="24"/>
+          <w:sz-cs w:val="24"/>
+          <w:color w:val="0000FF"/>
+        </w:rPr>
+        <w:t xml:space="preserve"/>
+      </w:r>
+    </w:p>
+    <w:p>
+      <w:pPr>
+        <w:jc w:val="center"/>
+      </w:pPr>
+      <w:r>
+        <w:rPr>
+          <w:rFonts w:ascii="Times" w:hAnsi="Times" w:cs="Times"/>
+          <w:sz w:val="24"/>
+          <w:sz-cs w:val="24"/>
+          <w:color w:val="0000FF"/>
         </w:rPr>
         <w:t xml:space="preserve"/>
       </w:r>
@@ -65,89 +68,97 @@
       <w:r>
         <w:rPr>
           <w:rFonts w:ascii="Times" w:hAnsi="Times" w:cs="Times"/>
-          <w:sz w:val="20"/>
-          <w:sz-cs w:val="20"/>
-        </w:rPr>
-        <w:t xml:space="preserve"/>
-      </w:r>
-    </w:p>
-    <w:p>
-      <w:pPr>
-        <w:jc w:val="center"/>
-      </w:pPr>
-      <w:r>
-        <w:rPr>
-          <w:rFonts w:ascii="Times" w:hAnsi="Times" w:cs="Times"/>
-          <w:sz w:val="20"/>
-          <w:sz-cs w:val="20"/>
-        </w:rPr>
-        <w:t xml:space="preserve"/>
-      </w:r>
-    </w:p>
-    <w:p>
-      <w:pPr/>
-      <w:r>
-        <w:rPr>
-          <w:rFonts w:ascii="Times" w:hAnsi="Times" w:cs="Times"/>
-          <w:sz w:val="20"/>
-          <w:sz-cs w:val="20"/>
-        </w:rPr>
-        <w:t xml:space="preserve"/>
-      </w:r>
-    </w:p>
-    <w:p>
-      <w:pPr>
-        <w:jc w:val="center"/>
-      </w:pPr>
-      <w:r>
-        <w:rPr>
-          <w:rFonts w:ascii="Times" w:hAnsi="Times" w:cs="Times"/>
-          <w:sz w:val="20"/>
-          <w:sz-cs w:val="20"/>
-        </w:rPr>
-        <w:t xml:space="preserve"/>
-      </w:r>
-    </w:p>
-    <w:p>
-      <w:pPr/>
-      <w:r>
-        <w:rPr>
-          <w:rFonts w:ascii="Times" w:hAnsi="Times" w:cs="Times"/>
-          <w:sz w:val="20"/>
-          <w:sz-cs w:val="20"/>
-        </w:rPr>
-        <w:t xml:space="preserve"/>
-      </w:r>
-    </w:p>
-    <w:p>
-      <w:pPr/>
-      <w:r>
-        <w:rPr>
-          <w:rFonts w:ascii="Times" w:hAnsi="Times" w:cs="Times"/>
-          <w:sz w:val="20"/>
-          <w:sz-cs w:val="20"/>
-        </w:rPr>
-        <w:t xml:space="preserve"/>
-      </w:r>
-    </w:p>
-    <w:p>
-      <w:pPr/>
-      <w:r>
-        <w:rPr>
-          <w:rFonts w:ascii="Times" w:hAnsi="Times" w:cs="Times"/>
-          <w:sz w:val="20"/>
-          <w:sz-cs w:val="20"/>
-        </w:rPr>
-        <w:t xml:space="preserve"/>
-      </w:r>
-    </w:p>
-    <w:p>
-      <w:pPr/>
-      <w:r>
-        <w:rPr>
-          <w:rFonts w:ascii="Times" w:hAnsi="Times" w:cs="Times"/>
-          <w:sz w:val="20"/>
-          <w:sz-cs w:val="20"/>
+          <w:sz w:val="24"/>
+          <w:sz-cs w:val="24"/>
+          <w:color w:val="0000FF"/>
+        </w:rPr>
+        <w:t xml:space="preserve"/>
+      </w:r>
+    </w:p>
+    <w:p>
+      <w:pPr>
+        <w:jc w:val="center"/>
+      </w:pPr>
+      <w:r>
+        <w:rPr>
+          <w:rFonts w:ascii="Times" w:hAnsi="Times" w:cs="Times"/>
+          <w:sz w:val="24"/>
+          <w:sz-cs w:val="24"/>
+          <w:color w:val="0000FF"/>
+        </w:rPr>
+        <w:t xml:space="preserve"/>
+      </w:r>
+    </w:p>
+    <w:p>
+      <w:pPr/>
+      <w:r>
+        <w:rPr>
+          <w:rFonts w:ascii="Times" w:hAnsi="Times" w:cs="Times"/>
+          <w:sz w:val="24"/>
+          <w:sz-cs w:val="24"/>
+          <w:color w:val="0000FF"/>
+        </w:rPr>
+        <w:t xml:space="preserve"/>
+      </w:r>
+    </w:p>
+    <w:p>
+      <w:pPr>
+        <w:jc w:val="center"/>
+      </w:pPr>
+      <w:r>
+        <w:rPr>
+          <w:rFonts w:ascii="Times" w:hAnsi="Times" w:cs="Times"/>
+          <w:sz w:val="24"/>
+          <w:sz-cs w:val="24"/>
+          <w:color w:val="0000FF"/>
+        </w:rPr>
+        <w:t xml:space="preserve"/>
+      </w:r>
+    </w:p>
+    <w:p>
+      <w:pPr/>
+      <w:r>
+        <w:rPr>
+          <w:rFonts w:ascii="Times" w:hAnsi="Times" w:cs="Times"/>
+          <w:sz w:val="24"/>
+          <w:sz-cs w:val="24"/>
+          <w:color w:val="0000FF"/>
+        </w:rPr>
+        <w:t xml:space="preserve"/>
+      </w:r>
+    </w:p>
+    <w:p>
+      <w:pPr/>
+      <w:r>
+        <w:rPr>
+          <w:rFonts w:ascii="Times" w:hAnsi="Times" w:cs="Times"/>
+          <w:sz w:val="24"/>
+          <w:sz-cs w:val="24"/>
+          <w:color w:val="0000FF"/>
+        </w:rPr>
+        <w:t xml:space="preserve"/>
+      </w:r>
+    </w:p>
+    <w:p>
+      <w:pPr/>
+      <w:r>
+        <w:rPr>
+          <w:rFonts w:ascii="Times" w:hAnsi="Times" w:cs="Times"/>
+          <w:sz w:val="24"/>
+          <w:sz-cs w:val="24"/>
+          <w:color w:val="0000FF"/>
+        </w:rPr>
+        <w:t xml:space="preserve"/>
+      </w:r>
+    </w:p>
+    <w:p>
+      <w:pPr/>
+      <w:r>
+        <w:rPr>
+          <w:rFonts w:ascii="Times" w:hAnsi="Times" w:cs="Times"/>
+          <w:sz w:val="24"/>
+          <w:sz-cs w:val="24"/>
+          <w:color w:val="0000FF"/>
         </w:rPr>
         <w:t xml:space="preserve"/>
       </w:r>
@@ -172,19 +183,21 @@
       <w:r>
         <w:rPr>
           <w:rFonts w:ascii="Times" w:hAnsi="Times" w:cs="Times"/>
-          <w:sz w:val="22"/>
-          <w:sz-cs w:val="22"/>
-        </w:rPr>
-        <w:t xml:space="preserve"/>
-      </w:r>
-    </w:p>
-    <w:p>
-      <w:pPr/>
-      <w:r>
-        <w:rPr>
-          <w:rFonts w:ascii="Times" w:hAnsi="Times" w:cs="Times"/>
-          <w:sz w:val="22"/>
-          <w:sz-cs w:val="22"/>
+          <w:sz w:val="24"/>
+          <w:sz-cs w:val="24"/>
+          <w:color w:val="0000FF"/>
+        </w:rPr>
+        <w:t xml:space="preserve">{numero_pagare}</w:t>
+      </w:r>
+    </w:p>
+    <w:p>
+      <w:pPr/>
+      <w:r>
+        <w:rPr>
+          <w:rFonts w:ascii="Times" w:hAnsi="Times" w:cs="Times"/>
+          <w:sz w:val="24"/>
+          <w:sz-cs w:val="24"/>
+          <w:color w:val="0000FF"/>
         </w:rPr>
         <w:t xml:space="preserve"/>
       </w:r>
@@ -212,32 +225,40 @@
           <w:sz w:val="44"/>
           <w:sz-cs w:val="44"/>
         </w:rPr>
-        <w:t xml:space="preserve">U$</w:t>
-      </w:r>
+        <w:t xml:space="preserve">{cuota_mensual_numeros}.-</w:t>
+      </w:r>
+    </w:p>
+    <w:p>
+      <w:pPr/>
       <w:r>
         <w:rPr>
           <w:rFonts w:ascii="Times" w:hAnsi="Times" w:cs="Times"/>
           <w:sz w:val="44"/>
           <w:sz-cs w:val="44"/>
-          <w:color w:val="0000FF"/>
-        </w:rPr>
-        <w:t xml:space="preserve"> </w:t>
-      </w:r>
-      <w:r>
-        <w:rPr>
-          <w:rFonts w:ascii="Times New Roman" w:hAnsi="Times New Roman" w:cs="Times New Roman"/>
+        </w:rPr>
+        <w:t xml:space="preserve"/>
+      </w:r>
+    </w:p>
+    <w:p>
+      <w:pPr/>
+      <w:r>
+        <w:rPr>
+          <w:rFonts w:ascii="Times" w:hAnsi="Times" w:cs="Times"/>
           <w:sz w:val="44"/>
           <w:sz-cs w:val="44"/>
         </w:rPr>
-        <w:t xml:space="preserve">     </w:t>
-      </w:r>
+        <w:t xml:space="preserve"/>
+      </w:r>
+    </w:p>
+    <w:p>
+      <w:pPr/>
       <w:r>
         <w:rPr>
           <w:rFonts w:ascii="Times" w:hAnsi="Times" w:cs="Times"/>
           <w:sz w:val="44"/>
           <w:sz-cs w:val="44"/>
         </w:rPr>
-        <w:t xml:space="preserve">.-</w:t>
+        <w:t xml:space="preserve"/>
       </w:r>
     </w:p>
     <w:p>
@@ -285,39 +306,6 @@
       </w:r>
     </w:p>
     <w:p>
-      <w:pPr/>
-      <w:r>
-        <w:rPr>
-          <w:rFonts w:ascii="Times" w:hAnsi="Times" w:cs="Times"/>
-          <w:sz w:val="44"/>
-          <w:sz-cs w:val="44"/>
-        </w:rPr>
-        <w:t xml:space="preserve"/>
-      </w:r>
-    </w:p>
-    <w:p>
-      <w:pPr/>
-      <w:r>
-        <w:rPr>
-          <w:rFonts w:ascii="Times" w:hAnsi="Times" w:cs="Times"/>
-          <w:sz w:val="44"/>
-          <w:sz-cs w:val="44"/>
-        </w:rPr>
-        <w:t xml:space="preserve"/>
-      </w:r>
-    </w:p>
-    <w:p>
-      <w:pPr/>
-      <w:r>
-        <w:rPr>
-          <w:rFonts w:ascii="Times" w:hAnsi="Times" w:cs="Times"/>
-          <w:sz w:val="44"/>
-          <w:sz-cs w:val="44"/>
-        </w:rPr>
-        <w:t xml:space="preserve"/>
-      </w:r>
-    </w:p>
-    <w:p>
       <w:pPr>
         <w:spacing w:before="120"/>
       </w:pPr>
@@ -334,19 +322,11 @@
       <w:pPr/>
       <w:r>
         <w:rPr>
-          <w:rFonts w:ascii="Times New Roman" w:hAnsi="Times New Roman" w:cs="Times New Roman"/>
-          <w:sz w:val="20"/>
-          <w:sz-cs w:val="20"/>
-        </w:rPr>
-        <w:t xml:space="preserve">     </w:t>
-      </w:r>
-      <w:r>
-        <w:rPr>
-          <w:rFonts w:ascii="Times" w:hAnsi="Times" w:cs="Times"/>
-          <w:sz w:val="20"/>
-          <w:sz-cs w:val="20"/>
-        </w:rPr>
-        <w:t xml:space="preserve"/>
+          <w:rFonts w:ascii="Times" w:hAnsi="Times" w:cs="Times"/>
+          <w:sz w:val="20"/>
+          <w:sz-cs w:val="20"/>
+        </w:rPr>
+        <w:t xml:space="preserve">CASEROS 344 PISO 5 OFICINA 46</w:t>
       </w:r>
     </w:p>
     <w:p>
@@ -364,19 +344,11 @@
       <w:pPr/>
       <w:r>
         <w:rPr>
-          <w:rFonts w:ascii="Times New Roman" w:hAnsi="Times New Roman" w:cs="Times New Roman"/>
-          <w:sz w:val="20"/>
-          <w:sz-cs w:val="20"/>
-        </w:rPr>
-        <w:t xml:space="preserve">     </w:t>
-      </w:r>
-      <w:r>
-        <w:rPr>
-          <w:rFonts w:ascii="Times" w:hAnsi="Times" w:cs="Times"/>
-          <w:sz w:val="20"/>
-          <w:sz-cs w:val="20"/>
-        </w:rPr>
-        <w:t xml:space="preserve"/>
+          <w:rFonts w:ascii="Times" w:hAnsi="Times" w:cs="Times"/>
+          <w:sz w:val="20"/>
+          <w:sz-cs w:val="20"/>
+        </w:rPr>
+        <w:t xml:space="preserve">{dia_firma_pagare}</w:t>
       </w:r>
     </w:p>
     <w:p>
@@ -394,19 +366,11 @@
       <w:pPr/>
       <w:r>
         <w:rPr>
-          <w:rFonts w:ascii="Times New Roman" w:hAnsi="Times New Roman" w:cs="Times New Roman"/>
-          <w:sz w:val="20"/>
-          <w:sz-cs w:val="20"/>
-        </w:rPr>
-        <w:t xml:space="preserve">     </w:t>
-      </w:r>
-      <w:r>
-        <w:rPr>
-          <w:rFonts w:ascii="Times" w:hAnsi="Times" w:cs="Times"/>
-          <w:sz w:val="20"/>
-          <w:sz-cs w:val="20"/>
-        </w:rPr>
-        <w:t xml:space="preserve"/>
+          <w:rFonts w:ascii="Times" w:hAnsi="Times" w:cs="Times"/>
+          <w:sz w:val="20"/>
+          <w:sz-cs w:val="20"/>
+        </w:rPr>
+        <w:t xml:space="preserve">{mes_firma_pagare}</w:t>
       </w:r>
     </w:p>
     <w:p>
@@ -424,19 +388,11 @@
       <w:pPr/>
       <w:r>
         <w:rPr>
-          <w:rFonts w:ascii="Times New Roman" w:hAnsi="Times New Roman" w:cs="Times New Roman"/>
-          <w:sz w:val="20"/>
-          <w:sz-cs w:val="20"/>
-        </w:rPr>
-        <w:t xml:space="preserve">     </w:t>
-      </w:r>
-      <w:r>
-        <w:rPr>
-          <w:rFonts w:ascii="Times" w:hAnsi="Times" w:cs="Times"/>
-          <w:sz w:val="20"/>
-          <w:sz-cs w:val="20"/>
-        </w:rPr>
-        <w:t xml:space="preserve"/>
+          <w:rFonts w:ascii="Times" w:hAnsi="Times" w:cs="Times"/>
+          <w:sz w:val="20"/>
+          <w:sz-cs w:val="20"/>
+        </w:rPr>
+        <w:t xml:space="preserve">{ano_pagare}</w:t>
       </w:r>
     </w:p>
     <w:p>
@@ -479,23 +435,7 @@
           <w:sz w:val="22"/>
           <w:sz-cs w:val="22"/>
         </w:rPr>
-        <w:t xml:space="preserve">a ASCANELLI S.A. –NO A LA ORDEN -, la cantidad de Pesos {monto_prestado_letras} ( {monto_prestado}), pagaderos en </w:t>
-      </w:r>
-      <w:r>
-        <w:rPr>
-          <w:rFonts w:ascii="Times New Roman" w:hAnsi="Times New Roman" w:cs="Times New Roman"/>
-          <w:sz w:val="22"/>
-          <w:sz-cs w:val="22"/>
-        </w:rPr>
-        <w:t xml:space="preserve">     </w:t>
-      </w:r>
-      <w:r>
-        <w:rPr>
-          <w:rFonts w:ascii="Times" w:hAnsi="Times" w:cs="Times"/>
-          <w:sz w:val="22"/>
-          <w:sz-cs w:val="22"/>
-        </w:rPr>
-        <w:t xml:space="preserve"> </w:t>
+        <w:t xml:space="preserve">a Cristian Santa Cruz, la cantidad de Pesos {cuota_mensual_letras} ({cuota_mensual_numeros}), pagaderos en Caseros 344 Piso 5 Oficina 46 </w:t>
       </w:r>
       <w:r>
         <w:rPr>
@@ -537,55 +477,55 @@
           <w:sz-cs w:val="20"/>
           <w:b/>
         </w:rPr>
-        <w:t xml:space="preserve">      Nombre: {nombre_apellido}</w:t>
-      </w:r>
-    </w:p>
-    <w:p>
-      <w:pPr/>
-      <w:r>
-        <w:rPr>
-          <w:rFonts w:ascii="Times" w:hAnsi="Times" w:cs="Times"/>
-          <w:sz w:val="20"/>
-          <w:sz-cs w:val="20"/>
-          <w:b/>
-        </w:rPr>
-        <w:t xml:space="preserve">NOMBRE DEL DEUDOR</w:t>
-      </w:r>
-    </w:p>
-    <w:p>
-      <w:pPr/>
-      <w:r>
-        <w:rPr>
-          <w:rFonts w:ascii="Times" w:hAnsi="Times" w:cs="Times"/>
-          <w:sz w:val="20"/>
-          <w:sz-cs w:val="20"/>
-          <w:b/>
-        </w:rPr>
-        <w:t xml:space="preserve"/>
-      </w:r>
-    </w:p>
-    <w:p>
-      <w:pPr/>
-      <w:r>
-        <w:rPr>
-          <w:rFonts w:ascii="Times" w:hAnsi="Times" w:cs="Times"/>
-          <w:sz w:val="20"/>
-          <w:sz-cs w:val="20"/>
-          <w:b/>
-        </w:rPr>
-        <w:t xml:space="preserve"/>
-      </w:r>
-    </w:p>
-    <w:p>
-      <w:pPr/>
-      <w:r>
-        <w:rPr>
-          <w:rFonts w:ascii="Times" w:hAnsi="Times" w:cs="Times"/>
-          <w:sz w:val="20"/>
-          <w:sz-cs w:val="20"/>
-          <w:b/>
-        </w:rPr>
-        <w:t xml:space="preserve">      </w:t>
+        <w:t xml:space="preserve">      Nombre:</w:t>
+      </w:r>
+    </w:p>
+    <w:p>
+      <w:pPr/>
+      <w:r>
+        <w:rPr>
+          <w:rFonts w:ascii="Times" w:hAnsi="Times" w:cs="Times"/>
+          <w:sz w:val="20"/>
+          <w:sz-cs w:val="20"/>
+          <w:b/>
+        </w:rPr>
+        <w:t xml:space="preserve">{nombre_apellido}</w:t>
+      </w:r>
+    </w:p>
+    <w:p>
+      <w:pPr/>
+      <w:r>
+        <w:rPr>
+          <w:rFonts w:ascii="Times" w:hAnsi="Times" w:cs="Times"/>
+          <w:sz w:val="20"/>
+          <w:sz-cs w:val="20"/>
+          <w:b/>
+        </w:rPr>
+        <w:t xml:space="preserve"/>
+      </w:r>
+    </w:p>
+    <w:p>
+      <w:pPr/>
+      <w:r>
+        <w:rPr>
+          <w:rFonts w:ascii="Times" w:hAnsi="Times" w:cs="Times"/>
+          <w:sz w:val="20"/>
+          <w:sz-cs w:val="20"/>
+          <w:b/>
+        </w:rPr>
+        <w:t xml:space="preserve"/>
+      </w:r>
+    </w:p>
+    <w:p>
+      <w:pPr/>
+      <w:r>
+        <w:rPr>
+          <w:rFonts w:ascii="Times" w:hAnsi="Times" w:cs="Times"/>
+          <w:sz w:val="20"/>
+          <w:sz-cs w:val="20"/>
+          <w:b/>
+        </w:rPr>
+        <w:t xml:space="preserve"/>
       </w:r>
     </w:p>
     <w:p>
@@ -633,17 +573,71 @@
           <w:rFonts w:ascii="Times" w:hAnsi="Times" w:cs="Times"/>
           <w:sz w:val="20"/>
           <w:sz-cs w:val="20"/>
-        </w:rPr>
-        <w:t xml:space="preserve">     Direccion: </w:t>
-      </w:r>
-      <w:r>
-        <w:rPr>
-          <w:rFonts w:ascii="Times" w:hAnsi="Times" w:cs="Times"/>
-          <w:sz w:val="20"/>
-          <w:sz-cs w:val="20"/>
-          <w:b/>
-        </w:rPr>
-        <w:t xml:space="preserve">{domicilio}</w:t>
+          <w:b/>
+        </w:rPr>
+        <w:t xml:space="preserve"/>
+      </w:r>
+    </w:p>
+    <w:p>
+      <w:pPr>
+        <w:jc w:val="center"/>
+      </w:pPr>
+      <w:r>
+        <w:rPr>
+          <w:rFonts w:ascii="Times" w:hAnsi="Times" w:cs="Times"/>
+          <w:sz w:val="20"/>
+          <w:sz-cs w:val="20"/>
+          <w:b/>
+        </w:rPr>
+        <w:t xml:space="preserve"/>
+      </w:r>
+    </w:p>
+    <w:p>
+      <w:pPr>
+        <w:jc w:val="center"/>
+      </w:pPr>
+      <w:r>
+        <w:rPr>
+          <w:rFonts w:ascii="Times" w:hAnsi="Times" w:cs="Times"/>
+          <w:sz w:val="20"/>
+          <w:sz-cs w:val="20"/>
+          <w:b/>
+        </w:rPr>
+        <w:t xml:space="preserve"/>
+      </w:r>
+    </w:p>
+    <w:p>
+      <w:pPr>
+        <w:jc w:val="center"/>
+      </w:pPr>
+      <w:r>
+        <w:rPr>
+          <w:rFonts w:ascii="Times" w:hAnsi="Times" w:cs="Times"/>
+          <w:sz w:val="20"/>
+          <w:sz-cs w:val="20"/>
+          <w:b/>
+        </w:rPr>
+        <w:t xml:space="preserve"/>
+      </w:r>
+    </w:p>
+    <w:p>
+      <w:pPr/>
+      <w:r>
+        <w:rPr>
+          <w:rFonts w:ascii="Times" w:hAnsi="Times" w:cs="Times"/>
+          <w:sz w:val="20"/>
+          <w:sz-cs w:val="20"/>
+        </w:rPr>
+        <w:t xml:space="preserve"> Direccion: </w:t>
+      </w:r>
+      <w:r>
+        <w:rPr>
+          <w:rFonts w:ascii="Times" w:hAnsi="Times" w:cs="Times"/>
+          <w:sz w:val="20"/>
+          <w:sz-cs w:val="20"/>
+          <w:b/>
+        </w:rPr>
+        <w:t xml:space="preserve"> {domicilio}</w:t>
       </w:r>
     </w:p>
     <w:p>
@@ -698,89 +692,6 @@
           <w:sz w:val="20"/>
           <w:sz-cs w:val="20"/>
         </w:rPr>
-        <w:t xml:space="preserve"/>
-      </w:r>
-    </w:p>
-    <w:p>
-      <w:pPr>
-        <w:jc w:val="center"/>
-      </w:pPr>
-      <w:r>
-        <w:rPr>
-          <w:rFonts w:ascii="Times" w:hAnsi="Times" w:cs="Times"/>
-          <w:sz w:val="20"/>
-          <w:sz-cs w:val="20"/>
-        </w:rPr>
-        <w:t xml:space="preserve"/>
-      </w:r>
-    </w:p>
-    <w:p>
-      <w:pPr>
-        <w:jc w:val="center"/>
-      </w:pPr>
-      <w:r>
-        <w:rPr>
-          <w:rFonts w:ascii="Times" w:hAnsi="Times" w:cs="Times"/>
-          <w:sz w:val="20"/>
-          <w:sz-cs w:val="20"/>
-        </w:rPr>
-        <w:t xml:space="preserve"/>
-      </w:r>
-    </w:p>
-    <w:p>
-      <w:pPr>
-        <w:jc w:val="center"/>
-      </w:pPr>
-      <w:r>
-        <w:rPr>
-          <w:rFonts w:ascii="Times" w:hAnsi="Times" w:cs="Times"/>
-          <w:sz w:val="20"/>
-          <w:sz-cs w:val="20"/>
-        </w:rPr>
-        <w:t xml:space="preserve"/>
-      </w:r>
-    </w:p>
-    <w:p>
-      <w:pPr/>
-      <w:r>
-        <w:rPr>
-          <w:rFonts w:ascii="Times" w:hAnsi="Times" w:cs="Times"/>
-          <w:sz w:val="20"/>
-          <w:sz-cs w:val="20"/>
-        </w:rPr>
-        <w:t xml:space="preserve"/>
-      </w:r>
-    </w:p>
-    <w:p>
-      <w:pPr/>
-      <w:r>
-        <w:rPr>
-          <w:rFonts w:ascii="Times" w:hAnsi="Times" w:cs="Times"/>
-          <w:sz w:val="20"/>
-          <w:sz-cs w:val="20"/>
-        </w:rPr>
-        <w:t xml:space="preserve"/>
-      </w:r>
-    </w:p>
-    <w:p>
-      <w:pPr/>
-      <w:r>
-        <w:rPr>
-          <w:rFonts w:ascii="Times" w:hAnsi="Times" w:cs="Times"/>
-          <w:sz w:val="20"/>
-          <w:sz-cs w:val="20"/>
-        </w:rPr>
-        <w:t xml:space="preserve"/>
-      </w:r>
-    </w:p>
-    <w:p>
-      <w:pPr/>
-      <w:r>
-        <w:rPr>
-          <w:rFonts w:ascii="Times" w:hAnsi="Times" w:cs="Times"/>
-          <w:sz w:val="20"/>
-          <w:sz-cs w:val="20"/>
-        </w:rPr>
         <w:t xml:space="preserve">------------------------------</w:t>
       </w:r>
     </w:p>
@@ -794,13 +705,290 @@
           <w:sz w:val="20"/>
           <w:sz-cs w:val="20"/>
         </w:rPr>
-        <w:t xml:space="preserve">CUIT - DNI</w:t>
-      </w:r>
-    </w:p>
-    <w:p>
-      <w:pPr>
-        <w:jc w:val="center"/>
-      </w:pPr>
+        <w:t xml:space="preserve">FIRMA</w:t>
+      </w:r>
+    </w:p>
+    <w:p>
+      <w:pPr>
+        <w:jc w:val="center"/>
+      </w:pPr>
+      <w:r>
+        <w:rPr>
+          <w:rFonts w:ascii="Times" w:hAnsi="Times" w:cs="Times"/>
+          <w:sz w:val="20"/>
+          <w:sz-cs w:val="20"/>
+        </w:rPr>
+        <w:t xml:space="preserve"/>
+      </w:r>
+    </w:p>
+    <w:p>
+      <w:pPr>
+        <w:jc w:val="center"/>
+      </w:pPr>
+      <w:r>
+        <w:rPr>
+          <w:rFonts w:ascii="Times" w:hAnsi="Times" w:cs="Times"/>
+          <w:sz w:val="20"/>
+          <w:sz-cs w:val="20"/>
+        </w:rPr>
+        <w:t xml:space="preserve"/>
+      </w:r>
+    </w:p>
+    <w:p>
+      <w:pPr>
+        <w:jc w:val="center"/>
+      </w:pPr>
+      <w:r>
+        <w:rPr>
+          <w:rFonts w:ascii="Times" w:hAnsi="Times" w:cs="Times"/>
+          <w:sz w:val="20"/>
+          <w:sz-cs w:val="20"/>
+        </w:rPr>
+        <w:t xml:space="preserve"/>
+      </w:r>
+    </w:p>
+    <w:p>
+      <w:pPr>
+        <w:jc w:val="center"/>
+      </w:pPr>
+      <w:r>
+        <w:rPr>
+          <w:rFonts w:ascii="Times" w:hAnsi="Times" w:cs="Times"/>
+          <w:sz w:val="20"/>
+          <w:sz-cs w:val="20"/>
+        </w:rPr>
+        <w:t xml:space="preserve"/>
+      </w:r>
+    </w:p>
+    <w:p>
+      <w:pPr>
+        <w:jc w:val="center"/>
+      </w:pPr>
+      <w:r>
+        <w:rPr>
+          <w:rFonts w:ascii="Times" w:hAnsi="Times" w:cs="Times"/>
+          <w:sz w:val="20"/>
+          <w:sz-cs w:val="20"/>
+        </w:rPr>
+        <w:t xml:space="preserve"/>
+      </w:r>
+    </w:p>
+    <w:p>
+      <w:pPr>
+        <w:jc w:val="center"/>
+      </w:pPr>
+      <w:r>
+        <w:rPr>
+          <w:rFonts w:ascii="Times" w:hAnsi="Times" w:cs="Times"/>
+          <w:sz w:val="20"/>
+          <w:sz-cs w:val="20"/>
+        </w:rPr>
+        <w:t xml:space="preserve"/>
+      </w:r>
+    </w:p>
+    <w:p>
+      <w:pPr/>
+      <w:r>
+        <w:rPr>
+          <w:rFonts w:ascii="Times" w:hAnsi="Times" w:cs="Times"/>
+          <w:sz w:val="20"/>
+          <w:sz-cs w:val="20"/>
+        </w:rPr>
+        <w:t xml:space="preserve"/>
+      </w:r>
+    </w:p>
+    <w:p>
+      <w:pPr>
+        <w:jc w:val="center"/>
+      </w:pPr>
+      <w:r>
+        <w:rPr>
+          <w:rFonts w:ascii="Times" w:hAnsi="Times" w:cs="Times"/>
+          <w:sz w:val="20"/>
+          <w:sz-cs w:val="20"/>
+        </w:rPr>
+        <w:t xml:space="preserve"/>
+      </w:r>
+    </w:p>
+    <w:p>
+      <w:pPr/>
+      <w:r>
+        <w:rPr>
+          <w:rFonts w:ascii="Times" w:hAnsi="Times" w:cs="Times"/>
+          <w:sz w:val="20"/>
+          <w:sz-cs w:val="20"/>
+        </w:rPr>
+        <w:t xml:space="preserve"/>
+      </w:r>
+    </w:p>
+    <w:p>
+      <w:pPr/>
+      <w:r>
+        <w:rPr>
+          <w:rFonts w:ascii="Times" w:hAnsi="Times" w:cs="Times"/>
+          <w:sz w:val="20"/>
+          <w:sz-cs w:val="20"/>
+        </w:rPr>
+        <w:t xml:space="preserve"/>
+      </w:r>
+    </w:p>
+    <w:p>
+      <w:pPr>
+        <w:jc w:val="center"/>
+      </w:pPr>
+      <w:r>
+        <w:rPr>
+          <w:rFonts w:ascii="Times" w:hAnsi="Times" w:cs="Times"/>
+          <w:sz w:val="20"/>
+          <w:sz-cs w:val="20"/>
+        </w:rPr>
+        <w:t xml:space="preserve"/>
+      </w:r>
+    </w:p>
+    <w:p>
+      <w:pPr>
+        <w:jc w:val="center"/>
+      </w:pPr>
+      <w:r>
+        <w:rPr>
+          <w:rFonts w:ascii="Times" w:hAnsi="Times" w:cs="Times"/>
+          <w:sz w:val="20"/>
+          <w:sz-cs w:val="20"/>
+        </w:rPr>
+        <w:t xml:space="preserve"/>
+      </w:r>
+    </w:p>
+    <w:p>
+      <w:pPr/>
+      <w:r>
+        <w:rPr>
+          <w:rFonts w:ascii="Times" w:hAnsi="Times" w:cs="Times"/>
+          <w:sz w:val="20"/>
+          <w:sz-cs w:val="20"/>
+        </w:rPr>
+        <w:t xml:space="preserve"/>
+      </w:r>
+    </w:p>
+    <w:p>
+      <w:pPr/>
+      <w:r>
+        <w:rPr>
+          <w:rFonts w:ascii="Times" w:hAnsi="Times" w:cs="Times"/>
+          <w:sz w:val="20"/>
+          <w:sz-cs w:val="20"/>
+        </w:rPr>
+        <w:t xml:space="preserve"/>
+      </w:r>
+    </w:p>
+    <w:p>
+      <w:pPr>
+        <w:jc w:val="center"/>
+      </w:pPr>
+      <w:r>
+        <w:rPr>
+          <w:rFonts w:ascii="Times" w:hAnsi="Times" w:cs="Times"/>
+          <w:sz w:val="20"/>
+          <w:sz-cs w:val="20"/>
+        </w:rPr>
+        <w:t xml:space="preserve"/>
+      </w:r>
+    </w:p>
+    <w:p>
+      <w:pPr>
+        <w:jc w:val="center"/>
+      </w:pPr>
+      <w:r>
+        <w:rPr>
+          <w:rFonts w:ascii="Times" w:hAnsi="Times" w:cs="Times"/>
+          <w:sz w:val="20"/>
+          <w:sz-cs w:val="20"/>
+        </w:rPr>
+        <w:t xml:space="preserve"/>
+      </w:r>
+    </w:p>
+    <w:p>
+      <w:pPr/>
+      <w:r>
+        <w:rPr>
+          <w:rFonts w:ascii="Times" w:hAnsi="Times" w:cs="Times"/>
+          <w:sz w:val="20"/>
+          <w:sz-cs w:val="20"/>
+        </w:rPr>
+        <w:t xml:space="preserve"/>
+      </w:r>
+    </w:p>
+    <w:p>
+      <w:pPr/>
+      <w:r>
+        <w:rPr>
+          <w:rFonts w:ascii="Times" w:hAnsi="Times" w:cs="Times"/>
+          <w:sz w:val="20"/>
+          <w:sz-cs w:val="20"/>
+        </w:rPr>
+        <w:t xml:space="preserve"/>
+      </w:r>
+    </w:p>
+    <w:p>
+      <w:pPr>
+        <w:jc w:val="center"/>
+      </w:pPr>
+      <w:r>
+        <w:rPr>
+          <w:rFonts w:ascii="Times" w:hAnsi="Times" w:cs="Times"/>
+          <w:sz w:val="20"/>
+          <w:sz-cs w:val="20"/>
+        </w:rPr>
+        <w:t xml:space="preserve"/>
+      </w:r>
+    </w:p>
+    <w:p>
+      <w:pPr>
+        <w:jc w:val="center"/>
+      </w:pPr>
+      <w:r>
+        <w:rPr>
+          <w:rFonts w:ascii="Times" w:hAnsi="Times" w:cs="Times"/>
+          <w:sz w:val="20"/>
+          <w:sz-cs w:val="20"/>
+        </w:rPr>
+        <w:t xml:space="preserve"/>
+      </w:r>
+    </w:p>
+    <w:p>
+      <w:pPr/>
+      <w:r>
+        <w:rPr>
+          <w:rFonts w:ascii="Times" w:hAnsi="Times" w:cs="Times"/>
+          <w:sz w:val="20"/>
+          <w:sz-cs w:val="20"/>
+        </w:rPr>
+        <w:t xml:space="preserve"/>
+      </w:r>
+    </w:p>
+    <w:p>
+      <w:pPr/>
+      <w:r>
+        <w:rPr>
+          <w:rFonts w:ascii="Times" w:hAnsi="Times" w:cs="Times"/>
+          <w:sz w:val="20"/>
+          <w:sz-cs w:val="20"/>
+        </w:rPr>
+        <w:t xml:space="preserve"/>
+      </w:r>
+    </w:p>
+    <w:p>
+      <w:pPr/>
+      <w:r>
+        <w:rPr>
+          <w:rFonts w:ascii="Times" w:hAnsi="Times" w:cs="Times"/>
+          <w:sz w:val="20"/>
+          <w:sz-cs w:val="20"/>
+        </w:rPr>
+        <w:t xml:space="preserve"/>
+      </w:r>
+    </w:p>
+    <w:p>
+      <w:pPr/>
       <w:r>
         <w:rPr>
           <w:rFonts w:ascii="Times" w:hAnsi="Times" w:cs="Times"/>
@@ -811,16 +999,94 @@
       </w:r>
     </w:p>
     <w:p>
-      <w:pPr>
-        <w:jc w:val="center"/>
-      </w:pPr>
-      <w:r>
-        <w:rPr>
-          <w:rFonts w:ascii="Times" w:hAnsi="Times" w:cs="Times"/>
-          <w:sz w:val="20"/>
-          <w:sz-cs w:val="20"/>
-        </w:rPr>
-        <w:t xml:space="preserve">ACLARACION – CARGO</w:t>
+      <w:pPr/>
+      <w:r>
+        <w:rPr>
+          <w:rFonts w:ascii="Times" w:hAnsi="Times" w:cs="Times"/>
+          <w:sz w:val="20"/>
+          <w:sz-cs w:val="20"/>
+        </w:rPr>
+        <w:t xml:space="preserve"/>
+        <w:tab/>
+        <w:t xml:space="preserve">   DNI</w:t>
+      </w:r>
+    </w:p>
+    <w:p>
+      <w:pPr>
+        <w:jc w:val="center"/>
+      </w:pPr>
+      <w:r>
+        <w:rPr>
+          <w:rFonts w:ascii="Times" w:hAnsi="Times" w:cs="Times"/>
+          <w:sz w:val="20"/>
+          <w:sz-cs w:val="20"/>
+        </w:rPr>
+        <w:t xml:space="preserve">------------------------------</w:t>
+      </w:r>
+    </w:p>
+    <w:p>
+      <w:pPr/>
+      <w:r>
+        <w:rPr>
+          <w:rFonts w:ascii="Times" w:hAnsi="Times" w:cs="Times"/>
+          <w:sz w:val="20"/>
+          <w:sz-cs w:val="20"/>
+        </w:rPr>
+        <w:t xml:space="preserve"/>
+        <w:tab/>
+        <w:t xml:space="preserve">   DNI</w:t>
+      </w:r>
+    </w:p>
+    <w:p>
+      <w:pPr>
+        <w:jc w:val="center"/>
+      </w:pPr>
+      <w:r>
+        <w:rPr>
+          <w:rFonts w:ascii="Times" w:hAnsi="Times" w:cs="Times"/>
+          <w:sz w:val="20"/>
+          <w:sz-cs w:val="20"/>
+        </w:rPr>
+        <w:t xml:space="preserve">------------------------------</w:t>
+      </w:r>
+    </w:p>
+    <w:p>
+      <w:pPr>
+        <w:jc w:val="center"/>
+      </w:pPr>
+      <w:r>
+        <w:rPr>
+          <w:rFonts w:ascii="Times" w:hAnsi="Times" w:cs="Times"/>
+          <w:sz w:val="20"/>
+          <w:sz-cs w:val="20"/>
+        </w:rPr>
+        <w:t xml:space="preserve">ACLARACION</w:t>
+      </w:r>
+    </w:p>
+    <w:p>
+      <w:pPr>
+        <w:jc w:val="center"/>
+      </w:pPr>
+      <w:r>
+        <w:rPr>
+          <w:rFonts w:ascii="Times" w:hAnsi="Times" w:cs="Times"/>
+          <w:sz w:val="20"/>
+          <w:sz-cs w:val="20"/>
+        </w:rPr>
+        <w:t xml:space="preserve">------------------------------</w:t>
+      </w:r>
+    </w:p>
+    <w:p>
+      <w:pPr>
+        <w:jc w:val="center"/>
+      </w:pPr>
+      <w:r>
+        <w:rPr>
+          <w:rFonts w:ascii="Times" w:hAnsi="Times" w:cs="Times"/>
+          <w:sz w:val="20"/>
+          <w:sz-cs w:val="20"/>
+        </w:rPr>
+        <w:t xml:space="preserve">ACLARACION</w:t>
       </w:r>
     </w:p>
     <w:p>
@@ -862,7 +1128,7 @@
     </w:p>
     <w:sectPr>
       <w:pgSz w:w="16840" w:h="11900"/>
-      <w:pgMar w:top="851" w:right="851" w:bottom="794" w:left="851"/>
+      <w:pgMar w:top="720" w:right="720" w:bottom="720" w:left="720"/>
     </w:sectPr>
   </w:body>
 </w:document>

</xml_diff>